<commit_message>
feat: add financial accounts management for organizations
- Implemented models, schemas, and services for managing financial accounts (bancos y cajas) in the application.
- Created API routes for CRUD operations on financial accounts, including listing active accounts and handling account creation, updates, and deletions.
- Added frontend components for displaying and managing financial accounts, including a modal for creating and editing accounts.
- Introduced migration to link financial accounts with existing cobros (payments) in the database.
- Enhanced the appearance and functionality of the accounts management interface in the settings page.
</commit_message>
<xml_diff>
--- a/backend/app/modules/presupuestos/plantillas_docx_defecto/descompuestos.docx
+++ b/backend/app/modules/presupuestos/plantillas_docx_defecto/descompuestos.docx
@@ -953,6 +953,28 @@
           </w:tcPr>
           <w:p>
             <w:r>
+              <w:t>banco.nombre / .entidad / .iban / .bic</w:t>
+            </w:r>
+          </w:p>
+        </w:tc>
+        <w:tc>
+          <w:tcPr>
+            <w:tcW w:type="dxa" w:w="4320"/>
+          </w:tcPr>
+          <w:p>
+            <w:r>
+              <w:t>La cuenta marcada como predeterminada en Ajustes -&gt; Bancos y cajas</w:t>
+            </w:r>
+          </w:p>
+        </w:tc>
+      </w:tr>
+      <w:tr>
+        <w:tc>
+          <w:tcPr>
+            <w:tcW w:type="dxa" w:w="4320"/>
+          </w:tcPr>
+          <w:p>
+            <w:r>
               <w:t>Logo: inserta cualquier imagen y ponle de texto alternativo la palabra logo</w:t>
             </w:r>
           </w:p>

</xml_diff>